<commit_message>
chore: update generated resume PDF and DOCX
</commit_message>
<xml_diff>
--- a/out/Resume_Gokul_Krishna.docx
+++ b/out/Resume_Gokul_Krishna.docx
@@ -47,13 +47,13 @@
         </w:rPr>
         <w:t xml:space="preserve">Bengaluru, India | +91 8861212836 | </w:t>
       </w:r>
-      <w:hyperlink w:history="1" r:id="rIdcupjikq3r9-sv3qt8sthi">
+      <w:hyperlink w:history="1" r:id="rId2ixot1lxqhar1bclqulii">
         <w:r>
           <w:rPr>
+            <w:u w:val="single"/>
             <w:color w:val="1155CC"/>
             <w:sz w:val="20"/>
             <w:szCs w:val="20"/>
-            <w:u w:val="single"/>
           </w:rPr>
           <w:t xml:space="preserve">gokulkrishna3567@gmail.com</w:t>
         </w:r>
@@ -66,13 +66,13 @@
         </w:rPr>
         <w:t xml:space="preserve"> | </w:t>
       </w:r>
-      <w:hyperlink w:history="1" r:id="rIdkkzctvl60rtzcbtfh-usd">
+      <w:hyperlink w:history="1" r:id="rIdu2pidcjrensne0vidgyt-">
         <w:r>
           <w:rPr>
+            <w:u w:val="single"/>
             <w:color w:val="1155CC"/>
             <w:sz w:val="20"/>
             <w:szCs w:val="20"/>
-            <w:u w:val="single"/>
           </w:rPr>
           <w:t xml:space="preserve">github.com/gokulkrishna15</w:t>
         </w:r>
@@ -83,16 +83,16 @@
         <w:pBdr>
           <w:bottom w:val="single" w:color="1F3864" w:sz="6" w:space="2"/>
         </w:pBdr>
-        <w:spacing w:after="80" w:before="220"/>
-      </w:pPr>
-      <w:r>
-        <w:rPr>
-          <w:b/>
-          <w:bCs/>
-          <w:color w:val="1F3864"/>
-          <w:spacing w:val="10"/>
+        <w:spacing w:before="220" w:after="80"/>
+      </w:pPr>
+      <w:r>
+        <w:rPr>
+          <w:b/>
+          <w:bCs/>
+          <w:color w:val="1F3864"/>
           <w:sz w:val="22"/>
           <w:szCs w:val="22"/>
+          <w:spacing w:val="10"/>
         </w:rPr>
         <w:t xml:space="preserve">SUMMARY</w:t>
       </w:r>
@@ -216,16 +216,16 @@
         <w:pBdr>
           <w:bottom w:val="single" w:color="1F3864" w:sz="6" w:space="2"/>
         </w:pBdr>
-        <w:spacing w:after="80" w:before="220"/>
-      </w:pPr>
-      <w:r>
-        <w:rPr>
-          <w:b/>
-          <w:bCs/>
-          <w:color w:val="1F3864"/>
-          <w:spacing w:val="10"/>
+        <w:spacing w:before="220" w:after="80"/>
+      </w:pPr>
+      <w:r>
+        <w:rPr>
+          <w:b/>
+          <w:bCs/>
+          <w:color w:val="1F3864"/>
           <w:sz w:val="22"/>
           <w:szCs w:val="22"/>
+          <w:spacing w:val="10"/>
         </w:rPr>
         <w:t xml:space="preserve">EXPERIENCE</w:t>
       </w:r>
@@ -235,7 +235,7 @@
         <w:tabs>
           <w:tab w:val="right" w:pos="9020"/>
         </w:tabs>
-        <w:spacing w:after="20" w:before="120"/>
+        <w:spacing w:before="120" w:after="20"/>
       </w:pPr>
       <w:r>
         <w:rPr>
@@ -1214,23 +1214,23 @@
         <w:pBdr>
           <w:bottom w:val="single" w:color="1F3864" w:sz="6" w:space="2"/>
         </w:pBdr>
-        <w:spacing w:after="80" w:before="220"/>
-      </w:pPr>
-      <w:r>
-        <w:rPr>
-          <w:b/>
-          <w:bCs/>
-          <w:color w:val="1F3864"/>
-          <w:spacing w:val="10"/>
+        <w:spacing w:before="220" w:after="80"/>
+      </w:pPr>
+      <w:r>
+        <w:rPr>
+          <w:b/>
+          <w:bCs/>
+          <w:color w:val="1F3864"/>
           <w:sz w:val="22"/>
           <w:szCs w:val="22"/>
+          <w:spacing w:val="10"/>
         </w:rPr>
         <w:t xml:space="preserve">PROJECTS</w:t>
       </w:r>
     </w:p>
     <w:p>
       <w:pPr>
-        <w:spacing w:after="20" w:before="100"/>
+        <w:spacing w:before="100" w:after="20"/>
       </w:pPr>
       <w:r>
         <w:rPr>
@@ -1424,7 +1424,7 @@
     </w:p>
     <w:p>
       <w:pPr>
-        <w:spacing w:after="20" w:before="100"/>
+        <w:spacing w:before="100" w:after="20"/>
       </w:pPr>
       <w:r>
         <w:rPr>
@@ -1435,13 +1435,13 @@
         </w:rPr>
         <w:t xml:space="preserve">Chiller Fault Detection &amp; Diagnosis (Python, 1D CNN) | </w:t>
       </w:r>
-      <w:hyperlink w:history="1" r:id="rIdhbri4vq8n-jemglamxahi">
+      <w:hyperlink w:history="1" r:id="rId9uafiininfr2wg1xigbjt">
         <w:r>
           <w:rPr>
+            <w:u w:val="single"/>
             <w:color w:val="1155CC"/>
             <w:sz w:val="20"/>
             <w:szCs w:val="20"/>
-            <w:u w:val="single"/>
           </w:rPr>
           <w:t xml:space="preserve">github.com/gokulkrishna15/chiller_fdd</w:t>
         </w:r>
@@ -1517,7 +1517,7 @@
     </w:p>
     <w:p>
       <w:pPr>
-        <w:spacing w:after="20" w:before="60"/>
+        <w:spacing w:before="60" w:after="20"/>
       </w:pPr>
       <w:r>
         <w:rPr>
@@ -1592,16 +1592,16 @@
         <w:pBdr>
           <w:bottom w:val="single" w:color="1F3864" w:sz="6" w:space="2"/>
         </w:pBdr>
-        <w:spacing w:after="80" w:before="220"/>
-      </w:pPr>
-      <w:r>
-        <w:rPr>
-          <w:b/>
-          <w:bCs/>
-          <w:color w:val="1F3864"/>
-          <w:spacing w:val="10"/>
+        <w:spacing w:before="220" w:after="80"/>
+      </w:pPr>
+      <w:r>
+        <w:rPr>
+          <w:b/>
+          <w:bCs/>
+          <w:color w:val="1F3864"/>
           <w:sz w:val="22"/>
           <w:szCs w:val="22"/>
+          <w:spacing w:val="10"/>
         </w:rPr>
         <w:t xml:space="preserve">TECHNICAL SKILLS</w:t>
       </w:r>
@@ -1845,16 +1845,16 @@
         <w:pBdr>
           <w:bottom w:val="single" w:color="1F3864" w:sz="6" w:space="2"/>
         </w:pBdr>
-        <w:spacing w:after="80" w:before="220"/>
-      </w:pPr>
-      <w:r>
-        <w:rPr>
-          <w:b/>
-          <w:bCs/>
-          <w:color w:val="1F3864"/>
-          <w:spacing w:val="10"/>
+        <w:spacing w:before="220" w:after="80"/>
+      </w:pPr>
+      <w:r>
+        <w:rPr>
+          <w:b/>
+          <w:bCs/>
+          <w:color w:val="1F3864"/>
           <w:sz w:val="22"/>
           <w:szCs w:val="22"/>
+          <w:spacing w:val="10"/>
         </w:rPr>
         <w:t xml:space="preserve">EDUCATION</w:t>
       </w:r>
@@ -1881,16 +1881,16 @@
         <w:pBdr>
           <w:bottom w:val="single" w:color="1F3864" w:sz="6" w:space="2"/>
         </w:pBdr>
-        <w:spacing w:after="80" w:before="220"/>
-      </w:pPr>
-      <w:r>
-        <w:rPr>
-          <w:b/>
-          <w:bCs/>
-          <w:color w:val="1F3864"/>
-          <w:spacing w:val="10"/>
+        <w:spacing w:before="220" w:after="80"/>
+      </w:pPr>
+      <w:r>
+        <w:rPr>
+          <w:b/>
+          <w:bCs/>
+          <w:color w:val="1F3864"/>
           <w:sz w:val="22"/>
           <w:szCs w:val="22"/>
+          <w:spacing w:val="10"/>
         </w:rPr>
         <w:t xml:space="preserve">CERTIFICATIONS</w:t>
       </w:r>
@@ -1911,13 +1911,13 @@
         </w:rPr>
         <w:t xml:space="preserve">Cloud Computing 101 — AWS Training (</w:t>
       </w:r>
-      <w:hyperlink w:history="1" r:id="rIdzf9jt_m2aeuv5rgji-q9l">
+      <w:hyperlink w:history="1" r:id="rIdv1mxx1ytxr-tya-575lwz">
         <w:r>
           <w:rPr>
+            <w:u w:val="single"/>
             <w:color w:val="1155CC"/>
             <w:sz w:val="20"/>
             <w:szCs w:val="20"/>
-            <w:u w:val="single"/>
           </w:rPr>
           <w:t xml:space="preserve">Credential</w:t>
         </w:r>
@@ -1973,13 +1973,13 @@
         </w:rPr>
         <w:t xml:space="preserve"> Foundation (</w:t>
       </w:r>
-      <w:hyperlink w:history="1" r:id="rIdwsi24wvcd0_no5cjj-gbd">
+      <w:hyperlink w:history="1" r:id="rIdoy1f4lqp_d7_nw8gjmkgr">
         <w:r>
           <w:rPr>
+            <w:u w:val="single"/>
             <w:color w:val="1155CC"/>
             <w:sz w:val="20"/>
             <w:szCs w:val="20"/>
-            <w:u w:val="single"/>
           </w:rPr>
           <w:t xml:space="preserve">Credential</w:t>
         </w:r>
@@ -2004,43 +2004,6 @@
 
 <file path=word/comments.xml><?xml version="1.0" encoding="utf-8"?>
 <w:comments xmlns:cx="http://schemas.microsoft.com/office/drawing/2014/chartex" xmlns:cx1="http://schemas.microsoft.com/office/drawing/2015/9/8/chartex" xmlns:cx2="http://schemas.microsoft.com/office/drawing/2015/10/21/chartex" xmlns:cx3="http://schemas.microsoft.com/office/drawing/2016/5/9/chartex" xmlns:cx4="http://schemas.microsoft.com/office/drawing/2016/5/10/chartex" xmlns:cx5="http://schemas.microsoft.com/office/drawing/2016/5/11/chartex" xmlns:cx6="http://schemas.microsoft.com/office/drawing/2016/5/12/chartex" xmlns:cx7="http://schemas.microsoft.com/office/drawing/2016/5/13/chartex" xmlns:cx8="http://schemas.microsoft.com/office/drawing/2016/5/14/chartex" xmlns:mc="http://schemas.openxmlformats.org/markup-compatibility/2006" xmlns:aink="http://schemas.microsoft.com/office/drawing/2016/ink" xmlns:am3d="http://schemas.microsoft.com/office/drawing/2017/model3d" xmlns:o="urn:schemas-microsoft-com:office:office" xmlns:r="http://schemas.openxmlformats.org/officeDocument/2006/relationships" xmlns:m="http://schemas.openxmlformats.org/officeDocument/2006/math" xmlns:v="urn:schemas-microsoft-com:vml" xmlns:wp14="http://schemas.microsoft.com/office/word/2010/wordprocessingDrawing" xmlns:wp="http://schemas.openxmlformats.org/drawingml/2006/wordprocessingDrawing" xmlns:w10="urn:schemas-microsoft-com:office:word" xmlns:w="http://schemas.openxmlformats.org/wordprocessingml/2006/main" xmlns:w14="http://schemas.microsoft.com/office/word/2010/wordml" xmlns:w15="http://schemas.microsoft.com/office/word/2012/wordml" xmlns:w16cex="http://schemas.microsoft.com/office/word/2018/wordml/cex" xmlns:w16cid="http://schemas.microsoft.com/office/word/2016/wordml/cid" xmlns:w16="http://schemas.microsoft.com/office/word/2018/wordml" xmlns:w16sdtdh="http://schemas.microsoft.com/office/word/2020/wordml/sdtdatahash" xmlns:w16se="http://schemas.microsoft.com/office/word/2015/wordml/symex" xmlns:wpg="http://schemas.microsoft.com/office/word/2010/wordprocessingGroup" xmlns:wpi="http://schemas.microsoft.com/office/word/2010/wordprocessingInk" xmlns:wne="http://schemas.microsoft.com/office/word/2006/wordml" xmlns:wps="http://schemas.microsoft.com/office/word/2010/wordprocessingShape"/>
-</file>
-
-<file path=word/endnotes.xml><?xml version="1.0" encoding="utf-8"?>
-<w:endnotes xmlns:wpc="http://schemas.microsoft.com/office/word/2010/wordprocessingCanvas" xmlns:mc="http://schemas.openxmlformats.org/markup-compatibility/2006" xmlns:o="urn:schemas-microsoft-com:office:office" xmlns:r="http://schemas.openxmlformats.org/officeDocument/2006/relationships" xmlns:m="http://schemas.openxmlformats.org/officeDocument/2006/math" xmlns:v="urn:schemas-microsoft-com:vml" xmlns:wp14="http://schemas.microsoft.com/office/word/2010/wordprocessingDrawing" xmlns:wp="http://schemas.openxmlformats.org/drawingml/2006/wordprocessingDrawing" xmlns:w10="urn:schemas-microsoft-com:office:word" xmlns:w="http://schemas.openxmlformats.org/wordprocessingml/2006/main" xmlns:w14="http://schemas.microsoft.com/office/word/2010/wordml" xmlns:w15="http://schemas.microsoft.com/office/word/2012/wordml" xmlns:wpg="http://schemas.microsoft.com/office/word/2010/wordprocessingGroup" xmlns:wpi="http://schemas.microsoft.com/office/word/2010/wordprocessingInk" xmlns:wne="http://schemas.microsoft.com/office/word/2006/wordml" xmlns:wps="http://schemas.microsoft.com/office/word/2010/wordprocessingShape" mc:Ignorable="w14 w15 wp14">
-  <w:endnote w:type="separator" w:id="-1">
-    <w:p>
-      <w:pPr>
-        <w:spacing w:after="0" w:line="240" w:lineRule="auto"/>
-      </w:pPr>
-      <w:r>
-        <w:rPr>
-          <w:rStyle w:val="EndnoteReference"/>
-        </w:rPr>
-        <w:endnoteRef/>
-      </w:r>
-      <w:r>
-        <w:separator/>
-      </w:r>
-    </w:p>
-  </w:endnote>
-  <w:endnote w:type="continuationSeparator" w:id="0">
-    <w:p>
-      <w:pPr>
-        <w:spacing w:after="0" w:line="240" w:lineRule="auto"/>
-      </w:pPr>
-      <w:r>
-        <w:rPr>
-          <w:rStyle w:val="EndnoteReference"/>
-        </w:rPr>
-        <w:endnoteRef/>
-      </w:r>
-      <w:r>
-        <w:continuationSeparator/>
-      </w:r>
-    </w:p>
-  </w:endnote>
-</w:endnotes>
 </file>
 
 <file path=word/footnotes.xml><?xml version="1.0" encoding="utf-8"?>
@@ -2274,8 +2237,8 @@
     <w:uiPriority w:val="99"/>
     <w:unhideWhenUsed/>
     <w:rPr>
+      <w:u w:val="single"/>
       <w:color w:val="0563C1"/>
-      <w:u w:val="single"/>
     </w:rPr>
   </w:style>
   <w:style w:type="character" w:styleId="FootnoteReference">
@@ -2315,42 +2278,5 @@
       <w:szCs w:val="20"/>
     </w:rPr>
   </w:style>
-  <w:style w:type="character" w:styleId="EndnoteReference">
-    <w:name w:val="endnote reference"/>
-    <w:basedOn w:val="DefaultParagraphFont"/>
-    <w:uiPriority w:val="99"/>
-    <w:semiHidden/>
-    <w:unhideWhenUsed/>
-    <w:rPr>
-      <w:vertAlign w:val="superscript"/>
-    </w:rPr>
-  </w:style>
-  <w:style w:type="paragraph" w:styleId="EndnoteText">
-    <w:name w:val="endnote text"/>
-    <w:basedOn w:val="Normal"/>
-    <w:link w:val="EndnoteTextChar"/>
-    <w:uiPriority w:val="99"/>
-    <w:semiHidden/>
-    <w:unhideWhenUsed/>
-    <w:pPr>
-      <w:spacing w:after="0" w:line="240" w:lineRule="auto"/>
-    </w:pPr>
-    <w:rPr>
-      <w:sz w:val="20"/>
-      <w:szCs w:val="20"/>
-    </w:rPr>
-  </w:style>
-  <w:style w:type="character" w:styleId="EndnoteTextChar">
-    <w:name w:val="Endnote Text Char"/>
-    <w:basedOn w:val="DefaultParagraphFont"/>
-    <w:link w:val="EndnoteText"/>
-    <w:uiPriority w:val="99"/>
-    <w:semiHidden/>
-    <w:unhideWhenUsed/>
-    <w:rPr>
-      <w:sz w:val="20"/>
-      <w:szCs w:val="20"/>
-    </w:rPr>
-  </w:style>
 </w:styles>
 </file>
</xml_diff>